<commit_message>
menjana dokumentacija i subtask delete
</commit_message>
<xml_diff>
--- a/documents/Faza 1 - Arhitektura i projektovanje softvera.docx
+++ b/documents/Faza 1 - Arhitektura i projektovanje softvera.docx
@@ -2198,7 +2198,7 @@
         <w:spacing w:before="40" w:after="60"/>
       </w:pPr>
       <w:r>
-        <w:t>kreiranje i upravljanje radnim prostorima i pozivanje članova tima sa različitim ulogama (Admin, Member, Guest),</w:t>
+        <w:t>kreiranje i upravljanje radnim prostorima i pozivanje članova tima sa različitim ulogama (Owner, Member, Guest),</w:t>
       </w:r>
     </w:p>
     <w:p>
@@ -2852,7 +2852,7 @@
           </w:tcPr>
           <w:p>
             <w:r>
-              <w:t>Sistem mora omogućiti kreiranje radnog prostora (Workspace) i pozivanje članova sa ulogama: Admin, Member, Guest.</w:t>
+              <w:t>Sistem mora omogućiti kreiranje radnog prostora (Workspace) i pozivanje članova sa ulogama: Owner, Member, Guest.</w:t>
             </w:r>
           </w:p>
         </w:tc>
@@ -4052,7 +4052,7 @@
         <w:jc w:val="both"/>
       </w:pPr>
       <w:r>
-        <w:t>Sistem je organizovan prema Client–Server arhitekturnom obrascu. Klijentska strana je Angular aplikacija koja korisnicima pruža interfejs za upravljanje radnim prostorima, pločama, zadacima i chat komunikacijom. Serverska strana je ASP.NET Core 8 aplikacija koja izlaže REST API za standardne CRUD zahteve i SignalR Hub (SystemHub) za real-time dvosmernu komunikaciju. Server izvršava poslovnu logiku, upravlja zaključavanjem, procesira domenske događaje i komunicira sa PostgreSQL bazom i RabbitMQ brokerom.</w:t>
+        <w:t>Sistem je organizovan prema Client–Server arhitekturnom obrascu. Klijentska strana je Angular aplikacija koja korisnicima pruža interfejs za upravljanje radnim prostorima, pločama, zadacima i chat komunikacijom. Serverska strana je ASP.NET Core 10 aplikacija koja izlaže REST API za standardne CRUD zahteve i SignalR Hub (SystemHub) za real-time dvosmernu komunikaciju. Server izvršava poslovnu logiku, upravlja zaključavanjem, procesira domenske događaje i komunicira sa PostgreSQL bazom i RabbitMQ brokerom.</w:t>
       </w:r>
     </w:p>
     <w:p>
@@ -4210,7 +4210,7 @@
         <w:spacing w:before="40" w:after="60"/>
       </w:pPr>
       <w:r>
-        <w:t>API sloj – sadrži REST kontrolere (AuthController, WorkspaceController, BoardController, WorkItemController, ChatController, BoardLockController, WorkItemLockController, CommentController, SubWorkItemController, WorkItemFileController, UserController) i SignalR Hub (SystemHub). Jedina zaduženost je primanje zahteva i delegiranje aplikacionom sloju.</w:t>
+        <w:t>API sloj – sadrži REST kontrolere (AuthController, WorkspaceController, BoardController, SprintController, WorkItemController, ChatController, BoardLockController, WorkItemLockController, CommentController, SubWorkItemController, WorkItemFileController, UserController) i SignalR Hub (SystemHub). Jedina zaduženost je primanje zahteva i delegiranje aplikacionom sloju.</w:t>
       </w:r>
     </w:p>
     <w:p>
@@ -4236,7 +4236,7 @@
         <w:spacing w:before="40" w:after="60"/>
       </w:pPr>
       <w:r>
-        <w:t>Domenski sloj – sadrži entitete (User, Workspace, Board, WorkItem, SubWorkItem, Comment, Message, Conversation, BoardLock, WorkItemLock), enumeracije (WorkItemStatus, Priority, UserRole), State mašinu, Observer i Command obrasce i DomainEventSubject.</w:t>
+        <w:t>Domenski sloj – sadrži entitete (User, Workspace, WorkspaceMember, Invitation, Board, BoardMember, Sprint, WorkItem, SubWorkItem, Comment, WorkItemFile, Message, Conversation, BoardLock, WorkItemLock, DomainEventLog), enumeracije (WorkItemStatus, Priority, UserRole), State mašinu, Observer i Command obrasce i DomainEventSubject.</w:t>
       </w:r>
     </w:p>
     <w:p>
@@ -4517,7 +4517,7 @@
         <w:spacing w:before="40" w:after="60"/>
       </w:pPr>
       <w:r>
-        <w:t>Veliki broj repozitorija (18 interfejsa) povećava obim registracija u DI kontejneru.</w:t>
+        <w:t>Veliki broj repozitorija (20 interfejsa) povećava obim registracija u DI kontejneru.</w:t>
       </w:r>
     </w:p>
     <w:p>
@@ -5170,7 +5170,7 @@
         <w:jc w:val="both"/>
       </w:pPr>
       <w:r>
-        <w:t>Observer obrazac je implementiran kroz DomainEventSubject klasu koja drži listu IDomainEventObserver implementacija. Registrovana su dva konkretna Observer-a: RabbitMqDomainEventObserver serijalizuje domenski događaj i objavljuje ga u RabbitMQ red sa perzistentnim svojstvima; SignalRDomainEventObserver je trenutno implementiran kao stub (prazna klasa) i ne sadrži logiku – objašnjenje u napomeni ispod. Observer-i se registruju kroz Dependency Injection kontejner, čime se postiže labava sprega između domena i infrastrukturnih tehnologija.</w:t>
+        <w:t>Observer obrazac je implementiran kroz DomainEventSubject klasu koja drži listu IDomainEventObserver implementacija. Registrovana su dva konkretna Observer-a: RabbitMqDomainEventObserver serijalizuje domenski događaj i objavljuje ga u RabbitMQ red sa perzistentnim svojstvima; SignalRDomainEventObserver salje ciljane SignalR notifikacije preko INotificationService za izabrane domenske dogadaje; ne sadrži logiku – objašnjenje u napomeni ispod. Observer-i se registruju kroz Dependency Injection kontejner, čime se postiže labava sprega između domena i infrastrukturnih tehnologija.</w:t>
       </w:r>
     </w:p>
     <w:p>
@@ -5305,7 +5305,7 @@
         <w:spacing w:before="40" w:after="60"/>
       </w:pPr>
       <w:r>
-        <w:t>SignalRDomainEventObserver je trenutno stub – može zbuniti developera koji pregleda kod.</w:t>
+        <w:t>SignalRDomainEventObserver salje samo subset domenskih dogadaja na SignalR – može zbuniti developera koji pregleda kod.</w:t>
       </w:r>
     </w:p>
     <w:p>
@@ -5503,7 +5503,7 @@
         <w:spacing w:before="40" w:after="60"/>
       </w:pPr>
       <w:r>
-        <w:t>Sedam komandi identične strukture povećava broj fajlova bez proporcionalne koristi u ovom stadiju razvoja.</w:t>
+        <w:t>Petnaest komandi identične strukture povećava broj fajlova bez proporcionalne koristi u ovom stadiju razvoja.</w:t>
       </w:r>
     </w:p>
     <w:p>
@@ -5845,7 +5845,7 @@
         <w:spacing w:before="40" w:after="60"/>
       </w:pPr>
       <w:r>
-        <w:t>BoardLock nije integrisan na Angular klijentskoj strani – frontend ne poziva POST /api/board-lock/open endpoint u trenutnoj verziji (planirana funkcionalnost).</w:t>
+        <w:t>BoardLock nije integrisan na Angular klijentskoj strani – frontend ne poziva POST /api/board-locks/open/{boardId} endpoint u trenutnoj verziji (planirana funkcionalnost).</w:t>
       </w:r>
     </w:p>
     <w:p>
@@ -6466,7 +6466,7 @@
         <w:spacing w:before="40" w:after="60"/>
       </w:pPr>
       <w:r>
-        <w:t>Korisnik A šalje POST /api/boardlock/{boardId}/open zahtev.</w:t>
+        <w:t>Korisnik A šalje POST /api/board-locks/open/{boardId} zahtev.</w:t>
       </w:r>
     </w:p>
     <w:p>
@@ -6934,7 +6934,7 @@
         <w:jc w:val="both"/>
       </w:pPr>
       <w:r>
-        <w:t>Za implementaciju serverske strane sistema izabran je programski okvir ASP.NET Core 8 sa programskim jezikom C# i .NET 10 runtime-om.</w:t>
+        <w:t>Za implementaciju serverske strane sistema izabran je programski okvir ASP.NET Core 10 sa programskim jezikom C# i .NET 10 runtime-om.</w:t>
       </w:r>
     </w:p>
     <w:p>
@@ -7423,34 +7423,7 @@
           </w:tcPr>
           <w:p>
             <w:r>
-              <w:rPr>
-                <w:b/>
-                <w:bCs/>
-              </w:rPr>
-              <w:t>BCrypt.Net-Next</w:t>
-            </w:r>
-          </w:p>
-        </w:tc>
-        <w:tc>
-          <w:tcPr>
-            <w:tcW w:w="6026" w:type="dxa"/>
-            <w:tcBorders>
-              <w:top w:val="single" w:color="CCCCCC" w:sz="0" w:space="0"/>
-              <w:left w:val="single" w:color="CCCCCC" w:sz="0" w:space="0"/>
-              <w:bottom w:val="single" w:color="CCCCCC" w:sz="0" w:space="0"/>
-              <w:right w:val="single" w:color="CCCCCC" w:sz="0" w:space="0"/>
-            </w:tcBorders>
-            <w:shd w:val="clear" w:color="auto" w:fill="FFFFFF"/>
-            <w:tcMar>
-              <w:top w:w="80" w:type="dxa"/>
-              <w:left w:w="120" w:type="dxa"/>
-              <w:bottom w:w="80" w:type="dxa"/>
-              <w:right w:w="120" w:type="dxa"/>
-            </w:tcMar>
-          </w:tcPr>
-          <w:p>
-            <w:r>
-              <w:t>Biblioteka za bezbedno hešovanje i verifikaciju korisničkih lozinki.</w:t>
+              <w:t>Microsoft.AspNetCore.Cryptography.KeyDerivation (custom PasswordHasher, PBKDF2 HMACSHA256)Biblioteka za bezbedno hešovanje i verifikaciju korisničkih lozinki.</w:t>
             </w:r>
           </w:p>
         </w:tc>
@@ -7727,7 +7700,7 @@
         <w:jc w:val="both"/>
       </w:pPr>
       <w:r>
-        <w:t>Napomena – poznata ograničenja klijentske implementacije: U trenutnoj verziji frontend-a postoje dvije tehničke napomene. Prvo, TaskService direktno dodaje Authorization header u svaki HTTP poziv zaobilazeći registrovani authInterceptor – preporučeni pristup je oslanjanje isključivo na interceptor kako bi upravljanje tokenom bilo centralizovano na jednom mjestu. Drugo, BoardLock funkcionalnost nije implementirana na klijentskoj strani – frontend ne poziva endpoint za zaključavanje ploče (POST /api/board-lock/open), što je planirano za narednu fazu razvoja.</w:t>
+        <w:t>Napomena – poznata ograničenja klijentske implementacije: U trenutnoj verziji frontend-a postoje dvije tehničke napomene. Prvo, TaskService direktno dodaje Authorization header u svaki HTTP poziv zaobilazeći registrovani authInterceptor – preporučeni pristup je oslanjanje isključivo na interceptor kako bi upravljanje tokenom bilo centralizovano na jednom mjestu. Drugo, BoardLock funkcionalnost nije implementirana na klijentskoj strani – frontend ne poziva endpoint za zaključavanje ploče (POST /api/board-locks/open/{boardId}), što je planirano za narednu fazu razvoja.</w:t>
       </w:r>
     </w:p>
     <w:p>

</xml_diff>